<commit_message>
Add feedback, QR tags, email alerts, and Flutter mobile client
- Restore scenario-based Inject Bag; remove drag-and-drop Sandbox (+ dnd-kit)
- Uniform staff accounts: drop per-checkpoint assignment across backend/UI;
  fix /bags and /alerts to show all bags/alerts to every staff member
- Customer feedback: public /feedback form + staff /support inbox
  (New -> In Review -> Resolved), mailto reply, feedback table SQL
- QR bag tags in bag detail modal (qrcode.react) + print
- Critical-anomaly email alerts to staff emails on file (notifier.py, SMTP)
- skywatcher-mobile/: Flutter iOS/Android client (login + live Alerts)
- Docs: CLAUDE.md updates; users_email.sql migration

Co-Authored-By: Claude Opus 4.8 <noreply@anthropic.com>
</commit_message>
<xml_diff>
--- a/system analysis.docx
+++ b/system analysis.docx
@@ -2176,6 +2176,7 @@
                 <w:color w:val="000000" w:themeColor="text1"/>
                 <w:sz w:val="20"/>
               </w:rPr>
+              <w:lastRenderedPageBreak/>
               <w:t>FR-15</w:t>
             </w:r>
           </w:p>
@@ -2195,15 +2196,7 @@
                 <w:color w:val="000000" w:themeColor="text1"/>
                 <w:sz w:val="20"/>
               </w:rPr>
-              <w:t xml:space="preserve">Ground staff users shall be able to resolve alerts belonging </w:t>
-            </w:r>
-            <w:r>
-              <w:rPr>
-                <w:color w:val="000000" w:themeColor="text1"/>
-                <w:sz w:val="20"/>
-              </w:rPr>
-              <w:lastRenderedPageBreak/>
-              <w:t>to their assigned checkpoint only.</w:t>
+              <w:t>Ground staff users shall be able to resolve alerts belonging to their assigned checkpoint only.</w:t>
             </w:r>
           </w:p>
         </w:tc>
@@ -2222,7 +2215,6 @@
                 <w:color w:val="000000" w:themeColor="text1"/>
                 <w:sz w:val="20"/>
               </w:rPr>
-              <w:lastRenderedPageBreak/>
               <w:t>High</w:t>
             </w:r>
           </w:p>
@@ -6220,7 +6212,14 @@
                 <w:color w:val="000000" w:themeColor="text1"/>
                 <w:sz w:val="20"/>
               </w:rPr>
-              <w:t>All Roles</w:t>
+              <w:t>A</w:t>
+            </w:r>
+            <w:r>
+              <w:rPr>
+                <w:color w:val="000000" w:themeColor="text1"/>
+                <w:sz w:val="20"/>
+              </w:rPr>
+              <w:t>dmin, Ground Staff</w:t>
             </w:r>
           </w:p>
         </w:tc>
@@ -6282,7 +6281,7 @@
                 <w:color w:val="000000" w:themeColor="text1"/>
                 <w:sz w:val="20"/>
               </w:rPr>
-              <w:t>Passenger (unauthenticated)</w:t>
+              <w:t>Passenger</w:t>
             </w:r>
           </w:p>
         </w:tc>
@@ -6344,7 +6343,7 @@
                 <w:color w:val="000000" w:themeColor="text1"/>
                 <w:sz w:val="20"/>
               </w:rPr>
-              <w:t>Passenger (authenticated)</w:t>
+              <w:t>Passenger</w:t>
             </w:r>
           </w:p>
         </w:tc>
@@ -8802,6 +8801,7 @@
           </w:tcPr>
           <w:p>
             <w:r>
+              <w:lastRenderedPageBreak/>
               <w:t>Exceptions</w:t>
             </w:r>
           </w:p>
@@ -8820,11 +8820,7 @@
             </w:r>
             <w:proofErr w:type="gramEnd"/>
             <w:r>
-              <w:t xml:space="preserve"> and a network error </w:t>
-            </w:r>
-            <w:r>
-              <w:lastRenderedPageBreak/>
-              <w:t>banner is displayed.</w:t>
+              <w:t xml:space="preserve"> and a network error banner is displayed.</w:t>
             </w:r>
           </w:p>
         </w:tc>
@@ -9404,7 +9400,6 @@
         <w:rPr>
           <w:b/>
         </w:rPr>
-        <w:lastRenderedPageBreak/>
         <w:t>UC12: Simulate RFID Events</w:t>
       </w:r>
     </w:p>
@@ -9965,6 +9960,7 @@
                 <w:b/>
                 <w:color w:val="000000" w:themeColor="text1"/>
               </w:rPr>
+              <w:lastRenderedPageBreak/>
               <w:t>Postcondition</w:t>
             </w:r>
           </w:p>
@@ -9999,7 +9995,6 @@
         <w:rPr>
           <w:color w:val="000000" w:themeColor="text1"/>
         </w:rPr>
-        <w:lastRenderedPageBreak/>
         <w:br w:type="page"/>
       </w:r>
     </w:p>

</xml_diff>